<commit_message>
Added repo link to the report
</commit_message>
<xml_diff>
--- a/PAIR-Reflection-03-HUYNH.docx
+++ b/PAIR-Reflection-03-HUYNH.docx
@@ -113,6 +113,24 @@
       </w:r>
       <w:r>
         <w:t xml:space="preserve">https://arxiv.org/abs/2505.13118</w:t>
+      </w:r>
+    </w:p>
+    <w:p>
+      <w:pPr>
+        <w:pStyle w:val="Center"/>
+      </w:pPr>
+      <w:r>
+        <w:rPr>
+          <w:b/>
+          <w:bCs/>
+        </w:rPr>
+        <w:t xml:space="preserve">Assignment Repository:</w:t>
+      </w:r>
+      <w:r>
+        <w:t xml:space="preserve"> </w:t>
+      </w:r>
+      <w:r>
+        <w:t xml:space="preserve">https://github.com/sokpheanal/ANLY735-PAIR-Reflection-03-sokpheanal-huynh/tree/main</w:t>
       </w:r>
     </w:p>
     <w:p>

</xml_diff>